<commit_message>
[SDP] updae SDP v2.0
</commit_message>
<xml_diff>
--- a/docs/do178/SDP_I-SCEET.docx
+++ b/docs/do178/SDP_I-SCEET.docx
@@ -361,7 +361,7 @@
                 <w:sz w:val="20"/>
                 <w:szCs w:val="20"/>
               </w:rPr>
-              <w:t>2026-03-15</w:t>
+              <w:t>2026-04-20</w:t>
             </w:r>
           </w:p>
         </w:tc>
@@ -1003,7 +1003,15 @@
                 <w:sz w:val="20"/>
                 <w:szCs w:val="20"/>
               </w:rPr>
-              <w:t>Hatem Adouani</w:t>
+              <w:t xml:space="preserve">Hatem </w:t>
+            </w:r>
+            <w:r>
+              <w:rPr>
+                <w:rFonts w:eastAsia="Arial" w:cs="Arial"/>
+                <w:sz w:val="20"/>
+                <w:szCs w:val="20"/>
+              </w:rPr>
+              <w:t>ADOUANI</w:t>
             </w:r>
           </w:p>
         </w:tc>
@@ -1056,6 +1064,7 @@
             </w:pPr>
             <w:r>
               <w:rPr/>
+              <w:t>2.0</w:t>
             </w:r>
           </w:p>
         </w:tc>
@@ -1077,7 +1086,12 @@
               <w:rPr/>
             </w:pPr>
             <w:r>
-              <w:rPr/>
+              <w:rPr>
+                <w:rFonts w:eastAsia="Arial" w:cs="Arial"/>
+                <w:sz w:val="20"/>
+                <w:szCs w:val="20"/>
+              </w:rPr>
+              <w:t>2026-04-20</w:t>
             </w:r>
           </w:p>
         </w:tc>
@@ -1099,7 +1113,20 @@
               <w:rPr/>
             </w:pPr>
             <w:r>
-              <w:rPr/>
+              <w:rPr>
+                <w:rFonts w:eastAsia="Arial" w:cs="Arial"/>
+                <w:sz w:val="20"/>
+                <w:szCs w:val="20"/>
+              </w:rPr>
+              <w:t xml:space="preserve">Hatem </w:t>
+            </w:r>
+            <w:r>
+              <w:rPr>
+                <w:rFonts w:eastAsia="Arial" w:cs="Arial"/>
+                <w:sz w:val="20"/>
+                <w:szCs w:val="20"/>
+              </w:rPr>
+              <w:t>ADOUANI</w:t>
             </w:r>
           </w:p>
         </w:tc>
@@ -1122,6 +1149,7 @@
             </w:pPr>
             <w:r>
               <w:rPr/>
+              <w:t>Alignment with the PSACv2.0 version</w:t>
             </w:r>
           </w:p>
         </w:tc>

</xml_diff>